<commit_message>
docs(proyecto): update progress report document
</commit_message>
<xml_diff>
--- a/proyecto-linea-produccion/avance/documento/avance-proyecto-linea-produccion.docx
+++ b/proyecto-linea-produccion/avance/documento/avance-proyecto-linea-produccion.docx
@@ -118,6 +118,18 @@
       </w:pPr>
       <w:r>
         <w:t xml:space="preserve">Determinar la capacidad productiva y el porcentaje de utilización de las cuatro estaciones mediante un modelo matemático de teoría de colas.</w:t>
+      </w:r>
+    </w:p>
+    <w:p>
+      <w:pPr>
+        <w:pStyle w:val="Compact"/>
+        <w:numPr>
+          <w:ilvl w:val="0"/>
+          <w:numId w:val="1001"/>
+        </w:numPr>
+      </w:pPr>
+      <w:r>
+        <w:t xml:space="preserve">Comparar tres posibles escenarios de producción mediante simulación de eventos discretos en Python, considerando la cantidad de órdenes procesadas, los tiempos de espera y la utilización de las estaciones.</w:t>
       </w:r>
     </w:p>
     <w:bookmarkEnd w:id="11"/>

</xml_diff>